<commit_message>
feat(group-13): final BoardroomXR project, paper, trial data and dossier (PR #28)
* Group 13 final submission: 4-member team study (11 sessions), paper, filled dossier (docx+pdf), real telemetry

* docs(group-13): update dossier with Section 3 release, Section 6 answers and I001 sign-off

* docs(group-13): add LinkedIn post URL to dossier Section 5
</commit_message>
<xml_diff>
--- a/Group_13_Kartik_Soha_Atharv_Ojaswi/docs/IVRAR_Group_13_Technical_Dossier.docx
+++ b/Group_13_Kartik_Soha_Atharv_Ojaswi/docs/IVRAR_Group_13_Technical_Dossier.docx
@@ -1381,7 +1381,7 @@
                     <w:sz w:val="14"/>
                     <w:szCs w:val="14"/>
                   </w:rPr>
-                  <w:t xml:space="preserve">type here</w:t>
+                  <w:t xml:space="preserve">ISO/IEC 19795-1:2021, Biometric performance testing and reporting, Part 1 (iso.org/standard/73515.html)</w:t>
                 </w:r>
               </w:sdtContent>
             </w:sdt>
@@ -1405,7 +1405,7 @@
                 </w:rPr>
                 <w:alias w:val="G13.S1.claim1.source_type"/>
                 <w:tag w:val="G13.S1.claim1.source_type"/>
-                <w:dropDownList>
+                <w:dropDownList w:lastValue="Standard (ISO / IEC / NFPA / NIST…)">
                   <w:listItem w:displayText="Select ▾" w:value=""/>
                   <w:listItem w:displayText="Standard (ISO / IEC / NFPA / NIST…)" w:value="Standard (ISO / IEC / NFPA / NIST…)"/>
                   <w:listItem w:displayText="Peer-reviewed paper (DOI)" w:value="Peer-reviewed paper (DOI)"/>
@@ -1420,7 +1420,7 @@
                     <w:sz w:val="14"/>
                     <w:szCs w:val="14"/>
                   </w:rPr>
-                  <w:t xml:space="preserve">Select ▾</w:t>
+                  <w:t xml:space="preserve">Standard (ISO / IEC / NFPA / NIST…)</w:t>
                 </w:r>
               </w:sdtContent>
             </w:sdt>
@@ -1444,7 +1444,7 @@
                 </w:rPr>
                 <w:alias w:val="G13.S1.claim1.verdict"/>
                 <w:tag w:val="G13.S1.claim1.verdict"/>
-                <w:dropDownList>
+                <w:dropDownList w:lastValue="Correct">
                   <w:listItem w:displayText="Select ▾" w:value=""/>
                   <w:listItem w:displayText="Keep" w:value="Keep"/>
                   <w:listItem w:displayText="Correct" w:value="Correct"/>
@@ -1457,7 +1457,7 @@
                     <w:sz w:val="14"/>
                     <w:szCs w:val="14"/>
                   </w:rPr>
-                  <w:t xml:space="preserve">Select ▾</w:t>
+                  <w:t xml:space="preserve">Correct</w:t>
                 </w:r>
               </w:sdtContent>
             </w:sdt>
@@ -1537,7 +1537,7 @@
                     <w:sz w:val="14"/>
                     <w:szCs w:val="14"/>
                   </w:rPr>
-                  <w:t xml:space="preserve">type here</w:t>
+                  <w:t xml:space="preserve">ISO/IEC 19795-1:2021 error-rate metrics; EER where FAR = FRR (our day2_eer.py)</w:t>
                 </w:r>
               </w:sdtContent>
             </w:sdt>
@@ -1561,7 +1561,7 @@
                 </w:rPr>
                 <w:alias w:val="G13.S1.claim2.source_type"/>
                 <w:tag w:val="G13.S1.claim2.source_type"/>
-                <w:dropDownList>
+                <w:dropDownList w:lastValue="Standard (ISO / IEC / NFPA / NIST…)">
                   <w:listItem w:displayText="Select ▾" w:value=""/>
                   <w:listItem w:displayText="Standard (ISO / IEC / NFPA / NIST…)" w:value="Standard (ISO / IEC / NFPA / NIST…)"/>
                   <w:listItem w:displayText="Peer-reviewed paper (DOI)" w:value="Peer-reviewed paper (DOI)"/>
@@ -1576,7 +1576,7 @@
                     <w:sz w:val="14"/>
                     <w:szCs w:val="14"/>
                   </w:rPr>
-                  <w:t xml:space="preserve">Select ▾</w:t>
+                  <w:t xml:space="preserve">Standard (ISO / IEC / NFPA / NIST…)</w:t>
                 </w:r>
               </w:sdtContent>
             </w:sdt>
@@ -1600,7 +1600,7 @@
                 </w:rPr>
                 <w:alias w:val="G13.S1.claim2.verdict"/>
                 <w:tag w:val="G13.S1.claim2.verdict"/>
-                <w:dropDownList>
+                <w:dropDownList w:lastValue="Keep">
                   <w:listItem w:displayText="Select ▾" w:value=""/>
                   <w:listItem w:displayText="Keep" w:value="Keep"/>
                   <w:listItem w:displayText="Correct" w:value="Correct"/>
@@ -1613,7 +1613,7 @@
                     <w:sz w:val="14"/>
                     <w:szCs w:val="14"/>
                   </w:rPr>
-                  <w:t xml:space="preserve">Select ▾</w:t>
+                  <w:t xml:space="preserve">Keep</w:t>
                 </w:r>
               </w:sdtContent>
             </w:sdt>
@@ -1690,7 +1690,7 @@
                     <w:sz w:val="14"/>
                     <w:szCs w:val="14"/>
                   </w:rPr>
-                  <w:t xml:space="preserve">type here</w:t>
+                  <w:t xml:space="preserve">Miller et al., Scientific Reports 10:17404 (2020), doi:10.1038/s41598-020-74486-y</w:t>
                 </w:r>
               </w:sdtContent>
             </w:sdt>
@@ -1713,7 +1713,7 @@
                 </w:rPr>
                 <w:alias w:val="G13.S1.claim3.source_type"/>
                 <w:tag w:val="G13.S1.claim3.source_type"/>
-                <w:dropDownList>
+                <w:dropDownList w:lastValue="Peer-reviewed paper (DOI)">
                   <w:listItem w:displayText="Select ▾" w:value=""/>
                   <w:listItem w:displayText="Standard (ISO / IEC / NFPA / NIST…)" w:value="Standard (ISO / IEC / NFPA / NIST…)"/>
                   <w:listItem w:displayText="Peer-reviewed paper (DOI)" w:value="Peer-reviewed paper (DOI)"/>
@@ -1728,7 +1728,7 @@
                     <w:sz w:val="14"/>
                     <w:szCs w:val="14"/>
                   </w:rPr>
-                  <w:t xml:space="preserve">Select ▾</w:t>
+                  <w:t xml:space="preserve">Peer-reviewed paper (DOI)</w:t>
                 </w:r>
               </w:sdtContent>
             </w:sdt>
@@ -1751,7 +1751,7 @@
                 </w:rPr>
                 <w:alias w:val="G13.S1.claim3.verdict"/>
                 <w:tag w:val="G13.S1.claim3.verdict"/>
-                <w:dropDownList>
+                <w:dropDownList w:lastValue="Correct">
                   <w:listItem w:displayText="Select ▾" w:value=""/>
                   <w:listItem w:displayText="Keep" w:value="Keep"/>
                   <w:listItem w:displayText="Correct" w:value="Correct"/>
@@ -1764,7 +1764,7 @@
                     <w:sz w:val="14"/>
                     <w:szCs w:val="14"/>
                   </w:rPr>
-                  <w:t xml:space="preserve">Select ▾</w:t>
+                  <w:t xml:space="preserve">Correct</w:t>
                 </w:r>
               </w:sdtContent>
             </w:sdt>
@@ -1814,18 +1814,38 @@
           </w:tcPr>
           <w:p>
             <w:pPr>
-              <w:spacing w:after="0"/>
-              <w:jc w:val="center"/>
-            </w:pPr>
-            <w:r/>
+              <w:spacing w:after="0" w:before="0" w:line="165" w:lineRule="exact"/>
+            </w:pPr>
             <w:r>
               <w:rPr>
-                <w:b w:val="0"/>
-                <w:i/>
-                <w:color w:val="595959"/>
-                <w:sz w:val="15"/>
+                <w:sz w:val="14"/>
+                <w:szCs w:val="14"/>
               </w:rPr>
-              <w:t>[ Write the bottleneck in plain language with one measurable baseline number and its source ]</w:t>
+              <w:t xml:space="preserve">In collaborative VR meetings, identity is checked once at the door. Afterwards, whoever puts on the headset inherits the avatar and sees confidential content, and nothing re-checks who is wearing it (0 identity checks per session after login).</w:t>
+            </w:r>
+          </w:p>
+          <w:p>
+            <w:pPr>
+              <w:spacing w:after="0" w:before="0" w:line="165" w:lineRule="exact"/>
+            </w:pPr>
+            <w:r>
+              <w:rPr>
+                <w:sz w:val="14"/>
+                <w:szCs w:val="14"/>
+              </w:rPr>
+              <w:t xml:space="preserve">The cheap 'continuous' safeguard often used instead, a head-speed anomaly detector, fails genuine users: on our own Quest build it would have revoked 11 of 12 genuine enrolments (pilot, 26-Oct) and 11 of 11 genuine sessions (team study, 27-Oct), typically within about 10 s.</w:t>
+            </w:r>
+          </w:p>
+          <w:p>
+            <w:pPr>
+              <w:spacing w:after="0" w:before="0" w:line="165" w:lineRule="exact"/>
+            </w:pPr>
+            <w:r>
+              <w:rPr>
+                <w:sz w:val="14"/>
+                <w:szCs w:val="14"/>
+              </w:rPr>
+              <w:t xml:space="preserve">Source: our on-device MFA and biometric logs (telemetry/real_participants, docs/paper). We measure success by EER, false-lockout rate and lockout latency.</w:t>
             </w:r>
           </w:p>
         </w:tc>
@@ -2303,7 +2323,7 @@
                 </w:rPr>
                 <w:alias w:val="G13.S2.script1.authorship"/>
                 <w:tag w:val="G13.S2.script1.authorship"/>
-                <w:dropDownList>
+                <w:dropDownList w:lastValue="Deleted / not used">
                   <w:listItem w:displayText="Select ▾" w:value=""/>
                   <w:listItem w:displayText="Written by us" w:value="Written by us"/>
                   <w:listItem w:displayText="Modified by us" w:value="Modified by us"/>
@@ -2317,7 +2337,7 @@
                     <w:sz w:val="14"/>
                     <w:szCs w:val="14"/>
                   </w:rPr>
-                  <w:t xml:space="preserve">Select ▾</w:t>
+                  <w:t xml:space="preserve">Deleted / not used</w:t>
                 </w:r>
               </w:sdtContent>
             </w:sdt>
@@ -2341,7 +2361,7 @@
                 </w:rPr>
                 <w:alias w:val="G13.S2.script1.author"/>
                 <w:tag w:val="G13.S2.script1.author"/>
-                <w:dropDownList>
+                <w:dropDownList w:lastValue="Shared">
                   <w:listItem w:displayText="Select ▾" w:value=""/>
                   <w:listItem w:displayText="I001" w:value="I001"/>
                   <w:listItem w:displayText="I007" w:value="I007"/>
@@ -2356,7 +2376,7 @@
                     <w:sz w:val="14"/>
                     <w:szCs w:val="14"/>
                   </w:rPr>
-                  <w:t xml:space="preserve">Select ▾</w:t>
+                  <w:t xml:space="preserve">Shared</w:t>
                 </w:r>
               </w:sdtContent>
             </w:sdt>
@@ -2369,7 +2389,15 @@
           <w:p>
             <w:pPr>
               <w:keepNext/>
-            </w:pPr>
+              <w:spacing w:after="0"/>
+            </w:pPr>
+            <w:r>
+              <w:rPr>
+                <w:sz w:val="14"/>
+                <w:szCs w:val="14"/>
+              </w:rPr>
+              <w:t xml:space="preserve">Starter scaffold; replaced by KinematicFeatures.cs</w:t>
+            </w:r>
           </w:p>
         </w:tc>
       </w:tr>
@@ -2416,7 +2444,7 @@
                 </w:rPr>
                 <w:alias w:val="G13.S2.script2.authorship"/>
                 <w:tag w:val="G13.S2.script2.authorship"/>
-                <w:dropDownList>
+                <w:dropDownList w:lastValue="Deleted / not used">
                   <w:listItem w:displayText="Select ▾" w:value=""/>
                   <w:listItem w:displayText="Written by us" w:value="Written by us"/>
                   <w:listItem w:displayText="Modified by us" w:value="Modified by us"/>
@@ -2430,7 +2458,7 @@
                     <w:sz w:val="14"/>
                     <w:szCs w:val="14"/>
                   </w:rPr>
-                  <w:t xml:space="preserve">Select ▾</w:t>
+                  <w:t xml:space="preserve">Deleted / not used</w:t>
                 </w:r>
               </w:sdtContent>
             </w:sdt>
@@ -2454,7 +2482,7 @@
                 </w:rPr>
                 <w:alias w:val="G13.S2.script2.author"/>
                 <w:tag w:val="G13.S2.script2.author"/>
-                <w:dropDownList>
+                <w:dropDownList w:lastValue="Shared">
                   <w:listItem w:displayText="Select ▾" w:value=""/>
                   <w:listItem w:displayText="I001" w:value="I001"/>
                   <w:listItem w:displayText="I007" w:value="I007"/>
@@ -2469,7 +2497,7 @@
                     <w:sz w:val="14"/>
                     <w:szCs w:val="14"/>
                   </w:rPr>
-                  <w:t xml:space="preserve">Select ▾</w:t>
+                  <w:t xml:space="preserve">Shared</w:t>
                 </w:r>
               </w:sdtContent>
             </w:sdt>
@@ -2482,7 +2510,15 @@
           <w:p>
             <w:pPr>
               <w:keepNext/>
-            </w:pPr>
+              <w:spacing w:after="0"/>
+            </w:pPr>
+            <w:r>
+              <w:rPr>
+                <w:sz w:val="14"/>
+                <w:szCs w:val="14"/>
+              </w:rPr>
+              <w:t xml:space="preserve">Starter scaffold; replaced by ContinuousBiometricEngine.cs</w:t>
+            </w:r>
           </w:p>
         </w:tc>
       </w:tr>
@@ -2516,7 +2552,7 @@
                     <w:sz w:val="14"/>
                     <w:szCs w:val="14"/>
                   </w:rPr>
-                  <w:t xml:space="preserve">type here</w:t>
+                  <w:t xml:space="preserve">ContinuousBiometricEngine.cs</w:t>
                 </w:r>
               </w:sdtContent>
             </w:sdt>
@@ -2540,7 +2576,7 @@
                 </w:rPr>
                 <w:alias w:val="G13.S2.script3.authorship"/>
                 <w:tag w:val="G13.S2.script3.authorship"/>
-                <w:dropDownList>
+                <w:dropDownList w:lastValue="Written by us">
                   <w:listItem w:displayText="Select ▾" w:value=""/>
                   <w:listItem w:displayText="Written by us" w:value="Written by us"/>
                   <w:listItem w:displayText="Modified by us" w:value="Modified by us"/>
@@ -2554,7 +2590,7 @@
                     <w:sz w:val="14"/>
                     <w:szCs w:val="14"/>
                   </w:rPr>
-                  <w:t xml:space="preserve">Select ▾</w:t>
+                  <w:t xml:space="preserve">Written by us</w:t>
                 </w:r>
               </w:sdtContent>
             </w:sdt>
@@ -2578,7 +2614,7 @@
                 </w:rPr>
                 <w:alias w:val="G13.S2.script3.author"/>
                 <w:tag w:val="G13.S2.script3.author"/>
-                <w:dropDownList>
+                <w:dropDownList w:lastValue="I001">
                   <w:listItem w:displayText="Select ▾" w:value=""/>
                   <w:listItem w:displayText="I001" w:value="I001"/>
                   <w:listItem w:displayText="I007" w:value="I007"/>
@@ -2593,7 +2629,7 @@
                     <w:sz w:val="14"/>
                     <w:szCs w:val="14"/>
                   </w:rPr>
-                  <w:t xml:space="preserve">Select ▾</w:t>
+                  <w:t xml:space="preserve">I001</w:t>
                 </w:r>
               </w:sdtContent>
             </w:sdt>
@@ -2639,7 +2675,7 @@
                     <w:sz w:val="14"/>
                     <w:szCs w:val="14"/>
                   </w:rPr>
-                  <w:t xml:space="preserve">type here</w:t>
+                  <w:t xml:space="preserve">KinematicFeatures.cs</w:t>
                 </w:r>
               </w:sdtContent>
             </w:sdt>
@@ -2662,7 +2698,7 @@
                 </w:rPr>
                 <w:alias w:val="G13.S2.script4.authorship"/>
                 <w:tag w:val="G13.S2.script4.authorship"/>
-                <w:dropDownList>
+                <w:dropDownList w:lastValue="Written by us">
                   <w:listItem w:displayText="Select ▾" w:value=""/>
                   <w:listItem w:displayText="Written by us" w:value="Written by us"/>
                   <w:listItem w:displayText="Modified by us" w:value="Modified by us"/>
@@ -2676,7 +2712,7 @@
                     <w:sz w:val="14"/>
                     <w:szCs w:val="14"/>
                   </w:rPr>
-                  <w:t xml:space="preserve">Select ▾</w:t>
+                  <w:t xml:space="preserve">Written by us</w:t>
                 </w:r>
               </w:sdtContent>
             </w:sdt>
@@ -2699,7 +2735,7 @@
                 </w:rPr>
                 <w:alias w:val="G13.S2.script4.author"/>
                 <w:tag w:val="G13.S2.script4.author"/>
-                <w:dropDownList>
+                <w:dropDownList w:lastValue="I013">
                   <w:listItem w:displayText="Select ▾" w:value=""/>
                   <w:listItem w:displayText="I001" w:value="I001"/>
                   <w:listItem w:displayText="I007" w:value="I007"/>
@@ -2714,7 +2750,7 @@
                     <w:sz w:val="14"/>
                     <w:szCs w:val="14"/>
                   </w:rPr>
-                  <w:t xml:space="preserve">Select ▾</w:t>
+                  <w:t xml:space="preserve">I013</w:t>
                 </w:r>
               </w:sdtContent>
             </w:sdt>
@@ -2770,18 +2806,236 @@
           </w:tcPr>
           <w:p>
             <w:pPr>
-              <w:spacing w:after="0"/>
-              <w:jc w:val="center"/>
-            </w:pPr>
-            <w:r/>
+              <w:spacing w:after="0" w:before="0" w:line="148" w:lineRule="exact"/>
+            </w:pPr>
             <w:r>
               <w:rPr>
-                <w:b w:val="0"/>
-                <w:i/>
-                <w:color w:val="595959"/>
-                <w:sz w:val="15"/>
+                <w:rFonts w:ascii="Consolas" w:hAnsi="Consolas" w:cs="Consolas"/>
+                <w:sz w:val="13"/>
+                <w:szCs w:val="13"/>
               </w:rPr>
-              <w:t>[ Paste code as text (Consolas 8 pt), not a screenshot. Include the file name and line numbers. ]</w:t>
+              <w:t xml:space="preserve">// Assets/Scripts/BoardroomXR/Biometrics/ContinuousBiometricEngine.cs, lines 208-236</w:t>
+            </w:r>
+          </w:p>
+          <w:p>
+            <w:pPr>
+              <w:spacing w:after="0" w:before="0" w:line="148" w:lineRule="exact"/>
+            </w:pPr>
+            <w:r>
+              <w:rPr>
+                <w:rFonts w:ascii="Consolas" w:hAnsi="Consolas" w:cs="Consolas"/>
+                <w:sz w:val="13"/>
+                <w:szCs w:val="13"/>
+              </w:rPr>
+              <w:t xml:space="preserve">208  private void ScoreStep(float[] f, float t) {</w:t>
+            </w:r>
+          </w:p>
+          <w:p>
+            <w:pPr>
+              <w:spacing w:after="0" w:before="0" w:line="148" w:lineRule="exact"/>
+            </w:pPr>
+            <w:r>
+              <w:rPr>
+                <w:rFonts w:ascii="Consolas" w:hAnsi="Consolas" w:cs="Consolas"/>
+                <w:sz w:val="13"/>
+                <w:szCs w:val="13"/>
+              </w:rPr>
+              <w:t xml:space="preserve">210      RawScore = Template.Score(f, LastZ);           // S = exp(-0.5 * mean(z^2))</w:t>
+            </w:r>
+          </w:p>
+          <w:p>
+            <w:pPr>
+              <w:spacing w:after="0" w:before="0" w:line="148" w:lineRule="exact"/>
+            </w:pPr>
+            <w:r>
+              <w:rPr>
+                <w:rFonts w:ascii="Consolas" w:hAnsi="Consolas" w:cs="Consolas"/>
+                <w:sz w:val="13"/>
+                <w:szCs w:val="13"/>
+              </w:rPr>
+              <w:t xml:space="preserve">214      if (!_smoothedInit) { SmoothedScore = RawScore; _smoothedInit = true; }</w:t>
+            </w:r>
+          </w:p>
+          <w:p>
+            <w:pPr>
+              <w:spacing w:after="0" w:before="0" w:line="148" w:lineRule="exact"/>
+            </w:pPr>
+            <w:r>
+              <w:rPr>
+                <w:rFonts w:ascii="Consolas" w:hAnsi="Consolas" w:cs="Consolas"/>
+                <w:sz w:val="13"/>
+                <w:szCs w:val="13"/>
+              </w:rPr>
+              <w:t xml:space="preserve">215      else SmoothedScore = Config.smoothing * RawScore + (1f - Config.smoothing) * SmoothedScore;</w:t>
+            </w:r>
+          </w:p>
+          <w:p>
+            <w:pPr>
+              <w:spacing w:after="0" w:before="0" w:line="148" w:lineRule="exact"/>
+            </w:pPr>
+            <w:r>
+              <w:rPr>
+                <w:rFonts w:ascii="Consolas" w:hAnsi="Consolas" w:cs="Consolas"/>
+                <w:sz w:val="13"/>
+                <w:szCs w:val="13"/>
+              </w:rPr>
+              <w:t xml:space="preserve">217      bool inGrace = t - _phaseStart &lt; Config.graceSeconds;</w:t>
+            </w:r>
+          </w:p>
+          <w:p>
+            <w:pPr>
+              <w:spacing w:after="0" w:before="0" w:line="148" w:lineRule="exact"/>
+            </w:pPr>
+            <w:r>
+              <w:rPr>
+                <w:rFonts w:ascii="Consolas" w:hAnsi="Consolas" w:cs="Consolas"/>
+                <w:sz w:val="13"/>
+                <w:szCs w:val="13"/>
+              </w:rPr>
+              <w:t xml:space="preserve">218      if (SmoothedScore &lt; Config.matchThreshold &amp;&amp; !inGrace) {</w:t>
+            </w:r>
+          </w:p>
+          <w:p>
+            <w:pPr>
+              <w:spacing w:after="0" w:before="0" w:line="148" w:lineRule="exact"/>
+            </w:pPr>
+            <w:r>
+              <w:rPr>
+                <w:rFonts w:ascii="Consolas" w:hAnsi="Consolas" w:cs="Consolas"/>
+                <w:sz w:val="13"/>
+                <w:szCs w:val="13"/>
+              </w:rPr>
+              <w:t xml:space="preserve">220          Violations++;</w:t>
+            </w:r>
+          </w:p>
+          <w:p>
+            <w:pPr>
+              <w:spacing w:after="0" w:before="0" w:line="148" w:lineRule="exact"/>
+            </w:pPr>
+            <w:r>
+              <w:rPr>
+                <w:rFonts w:ascii="Consolas" w:hAnsi="Consolas" w:cs="Consolas"/>
+                <w:sz w:val="13"/>
+                <w:szCs w:val="13"/>
+              </w:rPr>
+              <w:t xml:space="preserve">221          if (Violations &gt;= Config.violationsForLockout) {</w:t>
+            </w:r>
+          </w:p>
+          <w:p>
+            <w:pPr>
+              <w:spacing w:after="0" w:before="0" w:line="148" w:lineRule="exact"/>
+            </w:pPr>
+            <w:r>
+              <w:rPr>
+                <w:rFonts w:ascii="Consolas" w:hAnsi="Consolas" w:cs="Consolas"/>
+                <w:sz w:val="13"/>
+                <w:szCs w:val="13"/>
+              </w:rPr>
+              <w:t xml:space="preserve">223              SetState(BiometricState.LockedOut);      // host revokes IsVerified</w:t>
+            </w:r>
+          </w:p>
+          <w:p>
+            <w:pPr>
+              <w:spacing w:after="0" w:before="0" w:line="148" w:lineRule="exact"/>
+            </w:pPr>
+            <w:r>
+              <w:rPr>
+                <w:rFonts w:ascii="Consolas" w:hAnsi="Consolas" w:cs="Consolas"/>
+                <w:sz w:val="13"/>
+                <w:szCs w:val="13"/>
+              </w:rPr>
+              <w:t xml:space="preserve">225              OnLockout?.Invoke($"continuous biometric mismatch: score {SmoothedScore:F2} ...");</w:t>
+            </w:r>
+          </w:p>
+          <w:p>
+            <w:pPr>
+              <w:spacing w:after="0" w:before="0" w:line="148" w:lineRule="exact"/>
+            </w:pPr>
+            <w:r>
+              <w:rPr>
+                <w:rFonts w:ascii="Consolas" w:hAnsi="Consolas" w:cs="Consolas"/>
+                <w:sz w:val="13"/>
+                <w:szCs w:val="13"/>
+              </w:rPr>
+              <w:t xml:space="preserve">227              return;</w:t>
+            </w:r>
+          </w:p>
+          <w:p>
+            <w:pPr>
+              <w:spacing w:after="0" w:before="0" w:line="148" w:lineRule="exact"/>
+            </w:pPr>
+            <w:r>
+              <w:rPr>
+                <w:rFonts w:ascii="Consolas" w:hAnsi="Consolas" w:cs="Consolas"/>
+                <w:sz w:val="13"/>
+                <w:szCs w:val="13"/>
+              </w:rPr>
+              <w:t xml:space="preserve">228          }</w:t>
+            </w:r>
+          </w:p>
+          <w:p>
+            <w:pPr>
+              <w:spacing w:after="0" w:before="0" w:line="148" w:lineRule="exact"/>
+            </w:pPr>
+            <w:r>
+              <w:rPr>
+                <w:rFonts w:ascii="Consolas" w:hAnsi="Consolas" w:cs="Consolas"/>
+                <w:sz w:val="13"/>
+                <w:szCs w:val="13"/>
+              </w:rPr>
+              <w:t xml:space="preserve">229          SetState(BiometricState.Warning);</w:t>
+            </w:r>
+          </w:p>
+          <w:p>
+            <w:pPr>
+              <w:spacing w:after="0" w:before="0" w:line="148" w:lineRule="exact"/>
+            </w:pPr>
+            <w:r>
+              <w:rPr>
+                <w:rFonts w:ascii="Consolas" w:hAnsi="Consolas" w:cs="Consolas"/>
+                <w:sz w:val="13"/>
+                <w:szCs w:val="13"/>
+              </w:rPr>
+              <w:t xml:space="preserve">230      }</w:t>
+            </w:r>
+          </w:p>
+          <w:p>
+            <w:pPr>
+              <w:spacing w:after="0" w:before="0" w:line="148" w:lineRule="exact"/>
+            </w:pPr>
+            <w:r>
+              <w:rPr>
+                <w:rFonts w:ascii="Consolas" w:hAnsi="Consolas" w:cs="Consolas"/>
+                <w:sz w:val="13"/>
+                <w:szCs w:val="13"/>
+              </w:rPr>
+              <w:t xml:space="preserve">231      else {</w:t>
+            </w:r>
+          </w:p>
+          <w:p>
+            <w:pPr>
+              <w:spacing w:after="0" w:before="0" w:line="148" w:lineRule="exact"/>
+            </w:pPr>
+            <w:r>
+              <w:rPr>
+                <w:rFonts w:ascii="Consolas" w:hAnsi="Consolas" w:cs="Consolas"/>
+                <w:sz w:val="13"/>
+                <w:szCs w:val="13"/>
+              </w:rPr>
+              <w:t xml:space="preserve">233-235      Violations = 0; SetState(BiometricState.Verified); MaybeAdapt(f);  // adapt only when trusted</w:t>
+            </w:r>
+          </w:p>
+          <w:p>
+            <w:pPr>
+              <w:spacing w:after="0" w:before="0" w:line="148" w:lineRule="exact"/>
+            </w:pPr>
+            <w:r>
+              <w:rPr>
+                <w:rFonts w:ascii="Consolas" w:hAnsi="Consolas" w:cs="Consolas"/>
+                <w:sz w:val="13"/>
+                <w:szCs w:val="13"/>
+              </w:rPr>
+              <w:t xml:space="preserve">236      }</w:t>
             </w:r>
           </w:p>
         </w:tc>
@@ -2829,18 +3083,88 @@
           </w:tcPr>
           <w:p>
             <w:pPr>
-              <w:spacing w:after="0"/>
-              <w:jc w:val="center"/>
-            </w:pPr>
-            <w:r/>
+              <w:spacing w:after="0" w:before="0" w:line="165" w:lineRule="exact"/>
+            </w:pPr>
             <w:r>
               <w:rPr>
-                <w:b w:val="0"/>
-                <w:i/>
-                <w:color w:val="595959"/>
-                <w:sz w:val="15"/>
+                <w:b/>
+                <w:sz w:val="14"/>
+                <w:szCs w:val="14"/>
               </w:rPr>
-              <w:t>[ Derivation → symbols explained → worked example → where this value appears in your telemetry CSV ]</w:t>
+              <w:t xml:space="preserve">Derivation.</w:t>
+            </w:r>
+          </w:p>
+          <w:p>
+            <w:pPr>
+              <w:spacing w:after="0" w:before="0" w:line="165" w:lineRule="exact"/>
+            </w:pPr>
+            <w:r>
+              <w:rPr>
+                <w:sz w:val="14"/>
+                <w:szCs w:val="14"/>
+              </w:rPr>
+              <w:t xml:space="preserve">Per window, z_i = clip((f_i - mu_i)/sigma_i, -6, 6) for the 16 features (mu, sigma from 60 s enrolment). Score S = exp(-0.5 * (1/16) * sum z_i^2), so S = 1 at the template mean and falls as the average deviation grows.</w:t>
+            </w:r>
+          </w:p>
+          <w:p>
+            <w:pPr>
+              <w:spacing w:after="0" w:before="0" w:line="165" w:lineRule="exact"/>
+            </w:pPr>
+            <w:r>
+              <w:rPr>
+                <w:sz w:val="14"/>
+                <w:szCs w:val="14"/>
+              </w:rPr>
+              <w:t xml:space="preserve">Smoothed score S~_t = 0.35*S_t + 0.65*S~_(t-1). A violation is S~ &lt; theta. Balanced preset: theta = 0.15, k = 6 consecutive violations means lockout. EER: the theta at which FAR(theta) = FRR(theta).</w:t>
+            </w:r>
+          </w:p>
+          <w:p>
+            <w:pPr>
+              <w:spacing w:after="0" w:before="0" w:line="165" w:lineRule="exact"/>
+            </w:pPr>
+            <w:r>
+              <w:rPr>
+                <w:b/>
+                <w:sz w:val="14"/>
+                <w:szCs w:val="14"/>
+              </w:rPr>
+              <w:t xml:space="preserve">Worked example (session S04, real headset data):</w:t>
+            </w:r>
+          </w:p>
+          <w:p>
+            <w:pPr>
+              <w:spacing w:after="0" w:before="0" w:line="165" w:lineRule="exact"/>
+            </w:pPr>
+            <w:r>
+              <w:rPr>
+                <w:sz w:val="14"/>
+                <w:szCs w:val="14"/>
+              </w:rPr>
+              <w:t xml:space="preserve">t = 78.38 s: raw S = 0.0020, so mean z^2 = -2 ln(0.0020) = 12.4, an average deviation of 3.5 sigma per feature (top: head speed, z = 6).</w:t>
+            </w:r>
+          </w:p>
+          <w:p>
+            <w:pPr>
+              <w:spacing w:after="0" w:before="0" w:line="165" w:lineRule="exact"/>
+            </w:pPr>
+            <w:r>
+              <w:rPr>
+                <w:sz w:val="14"/>
+                <w:szCs w:val="14"/>
+              </w:rPr>
+              <w:t xml:space="preserve">S~ = 0.35*0.0020 + 0.65*0.2212 = 0.1445 &lt; 0.15, so violation 1 (Warning). Five more windows follow, and lockout comes at t = 80.90 s, 2.52 s after the first warning.</w:t>
+            </w:r>
+          </w:p>
+          <w:p>
+            <w:pPr>
+              <w:spacing w:after="0" w:before="0" w:line="165" w:lineRule="exact"/>
+            </w:pPr>
+            <w:r>
+              <w:rPr>
+                <w:sz w:val="14"/>
+                <w:szCs w:val="14"/>
+              </w:rPr>
+              <w:t xml:space="preserve">Where in the CSV: telemetry/real_participants/S04_window_scores.csv, columns t, raw_score, smoothed_score, violations, head_speed_mean.</w:t>
             </w:r>
           </w:p>
         </w:tc>
@@ -3165,7 +3489,7 @@
                     <w:sz w:val="15"/>
                     <w:szCs w:val="15"/>
                   </w:rPr>
-                  <w:t xml:space="preserve">type here</w:t>
+                  <w:t xml:space="preserve">6b5e67742f271079066baaf14eafe516f411e118</w:t>
                 </w:r>
               </w:sdtContent>
             </w:sdt>
@@ -3224,7 +3548,7 @@
                     <w:sz w:val="15"/>
                     <w:szCs w:val="15"/>
                   </w:rPr>
-                  <w:t xml:space="preserve">type here</w:t>
+                  <w:t xml:space="preserve">https://github.com/kartik-agrawal-01/NMIMS-MPSTME-IVRAR-2027/releases/tag/group-13-v1.0 (PR: github.com/sunny-nanade/NMIMS-MPSTME-IVRAR-2026/pull/28)</w:t>
                 </w:r>
               </w:sdtContent>
             </w:sdt>
@@ -3275,7 +3599,7 @@
                 </w:rPr>
                 <w:alias w:val="G13.S3.lfs_rules_ok"/>
                 <w:tag w:val="G13.S3.lfs_rules_ok"/>
-                <w:dropDownList>
+                <w:dropDownList w:lastValue="Yes">
                   <w:listItem w:displayText="Select ▾" w:value=""/>
                   <w:listItem w:displayText="Yes" w:value="Yes"/>
                   <w:listItem w:displayText="No" w:value="No"/>
@@ -3287,7 +3611,7 @@
                     <w:sz w:val="15"/>
                     <w:szCs w:val="15"/>
                   </w:rPr>
-                  <w:t xml:space="preserve">Select ▾</w:t>
+                  <w:t xml:space="preserve">Yes</w:t>
                 </w:r>
               </w:sdtContent>
             </w:sdt>
@@ -3401,7 +3725,7 @@
                 </w:rPr>
                 <w:alias w:val="G13.S3.no_builds_in_git"/>
                 <w:tag w:val="G13.S3.no_builds_in_git"/>
-                <w:dropDownList>
+                <w:dropDownList w:lastValue="Yes">
                   <w:listItem w:displayText="Select ▾" w:value=""/>
                   <w:listItem w:displayText="Yes" w:value="Yes"/>
                   <w:listItem w:displayText="No" w:value="No"/>
@@ -3413,7 +3737,7 @@
                     <w:sz w:val="15"/>
                     <w:szCs w:val="15"/>
                   </w:rPr>
-                  <w:t xml:space="preserve">Select ▾</w:t>
+                  <w:t xml:space="preserve">Yes</w:t>
                 </w:r>
               </w:sdtContent>
             </w:sdt>
@@ -3464,7 +3788,7 @@
                 </w:rPr>
                 <w:alias w:val="G13.S3.release_runs"/>
                 <w:tag w:val="G13.S3.release_runs"/>
-                <w:dropDownList>
+                <w:dropDownList w:lastValue="Yes">
                   <w:listItem w:displayText="Select ▾" w:value=""/>
                   <w:listItem w:displayText="Yes" w:value="Yes"/>
                   <w:listItem w:displayText="No" w:value="No"/>
@@ -3476,7 +3800,7 @@
                     <w:sz w:val="15"/>
                     <w:szCs w:val="15"/>
                   </w:rPr>
-                  <w:t xml:space="preserve">Select ▾</w:t>
+                  <w:t xml:space="preserve">Yes</w:t>
                 </w:r>
               </w:sdtContent>
             </w:sdt>
@@ -3525,7 +3849,7 @@
                 </w:rPr>
                 <w:alias w:val="G13.S3.dossier_committed"/>
                 <w:tag w:val="G13.S3.dossier_committed"/>
-                <w:dropDownList>
+                <w:dropDownList w:lastValue="Yes">
                   <w:listItem w:displayText="Select ▾" w:value=""/>
                   <w:listItem w:displayText="Yes" w:value="Yes"/>
                   <w:listItem w:displayText="No" w:value="No"/>
@@ -3537,7 +3861,7 @@
                     <w:sz w:val="15"/>
                     <w:szCs w:val="15"/>
                   </w:rPr>
-                  <w:t xml:space="preserve">Select ▾</w:t>
+                  <w:t xml:space="preserve">Yes</w:t>
                 </w:r>
               </w:sdtContent>
             </w:sdt>
@@ -3721,7 +4045,7 @@
                     <w:sz w:val="15"/>
                     <w:szCs w:val="15"/>
                   </w:rPr>
-                  <w:t xml:space="preserve">type here</w:t>
+                  <w:t xml:space="preserve">1</w:t>
                 </w:r>
               </w:sdtContent>
             </w:sdt>
@@ -3800,7 +4124,7 @@
                     <w:sz w:val="15"/>
                     <w:szCs w:val="15"/>
                   </w:rPr>
-                  <w:t xml:space="preserve">type here</w:t>
+                  <w:t xml:space="preserve">1</w:t>
                 </w:r>
               </w:sdtContent>
             </w:sdt>
@@ -3879,7 +4203,7 @@
                     <w:sz w:val="15"/>
                     <w:szCs w:val="15"/>
                   </w:rPr>
-                  <w:t xml:space="preserve">type here</w:t>
+                  <w:t xml:space="preserve">11726</w:t>
                 </w:r>
               </w:sdtContent>
             </w:sdt>
@@ -3958,7 +4282,7 @@
                     <w:sz w:val="15"/>
                     <w:szCs w:val="15"/>
                   </w:rPr>
-                  <w:t xml:space="preserve">type here</w:t>
+                  <w:t xml:space="preserve">124</w:t>
                 </w:r>
               </w:sdtContent>
             </w:sdt>
@@ -4037,7 +4361,7 @@
                     <w:sz w:val="15"/>
                     <w:szCs w:val="15"/>
                   </w:rPr>
-                  <w:t xml:space="preserve">type here</w:t>
+                  <w:t xml:space="preserve">18</w:t>
                 </w:r>
               </w:sdtContent>
             </w:sdt>
@@ -4113,7 +4437,7 @@
                     <w:sz w:val="15"/>
                     <w:szCs w:val="15"/>
                   </w:rPr>
-                  <w:t xml:space="preserve">type here</w:t>
+                  <w:t xml:space="preserve">17</w:t>
                 </w:r>
               </w:sdtContent>
             </w:sdt>
@@ -4322,7 +4646,7 @@
                     <w:sz w:val="15"/>
                     <w:szCs w:val="15"/>
                   </w:rPr>
-                  <w:t xml:space="preserve">type here</w:t>
+                  <w:t xml:space="preserve">kartik-agrawal-01</w:t>
                 </w:r>
               </w:sdtContent>
             </w:sdt>
@@ -4354,7 +4678,7 @@
                     <w:sz w:val="15"/>
                     <w:szCs w:val="15"/>
                   </w:rPr>
-                  <w:t xml:space="preserve">type here</w:t>
+                  <w:t xml:space="preserve">1</w:t>
                 </w:r>
               </w:sdtContent>
             </w:sdt>
@@ -4386,7 +4710,7 @@
                     <w:sz w:val="15"/>
                     <w:szCs w:val="15"/>
                   </w:rPr>
-                  <w:t xml:space="preserve">type here</w:t>
+                  <w:t xml:space="preserve">25%</w:t>
                 </w:r>
               </w:sdtContent>
             </w:sdt>
@@ -5187,7 +5511,7 @@
                     <w:sz w:val="15"/>
                     <w:szCs w:val="15"/>
                   </w:rPr>
-                  <w:t xml:space="preserve">type here</w:t>
+                  <w:t xml:space="preserve">4 (team members), 11 sessions</w:t>
                 </w:r>
               </w:sdtContent>
             </w:sdt>
@@ -5238,7 +5562,7 @@
                 </w:rPr>
                 <w:alias w:val="G13.S4.design"/>
                 <w:tag w:val="G13.S4.design"/>
-                <w:dropDownList>
+                <w:dropDownList w:lastValue="One condition only">
                   <w:listItem w:displayText="Select ▾" w:value=""/>
                   <w:listItem w:displayText="One condition only" w:value="One condition only"/>
                   <w:listItem w:displayText="Within-subjects (everyone tries both)" w:value="Within-subjects (everyone tries both)"/>
@@ -5251,7 +5575,7 @@
                     <w:sz w:val="15"/>
                     <w:szCs w:val="15"/>
                   </w:rPr>
-                  <w:t xml:space="preserve">Select ▾</w:t>
+                  <w:t xml:space="preserve">One condition only</w:t>
                 </w:r>
               </w:sdtContent>
             </w:sdt>
@@ -5310,7 +5634,7 @@
                     <w:sz w:val="15"/>
                     <w:szCs w:val="15"/>
                   </w:rPr>
-                  <w:t xml:space="preserve">type here</w:t>
+                  <w:t xml:space="preserve">26-27 Oct 2026, MPSTME Mumbai, Meta Quest 2</w:t>
                 </w:r>
               </w:sdtContent>
             </w:sdt>
@@ -5367,7 +5691,7 @@
                     <w:sz w:val="15"/>
                     <w:szCs w:val="15"/>
                   </w:rPr>
-                  <w:t xml:space="preserve">type here</w:t>
+                  <w:t xml:space="preserve">Group_13_.../telemetry/real_participants/</w:t>
                 </w:r>
               </w:sdtContent>
             </w:sdt>
@@ -5954,7 +6278,7 @@
                     <w:sz w:val="15"/>
                     <w:szCs w:val="15"/>
                   </w:rPr>
-                  <w:t xml:space="preserve">type here</w:t>
+                  <w:t xml:space="preserve">11</w:t>
                 </w:r>
               </w:sdtContent>
             </w:sdt>
@@ -5985,7 +6309,7 @@
                     <w:sz w:val="15"/>
                     <w:szCs w:val="15"/>
                   </w:rPr>
-                  <w:t xml:space="preserve">type here</w:t>
+                  <w:t xml:space="preserve">25.4 %</w:t>
                 </w:r>
               </w:sdtContent>
             </w:sdt>
@@ -6016,7 +6340,7 @@
                     <w:sz w:val="15"/>
                     <w:szCs w:val="15"/>
                   </w:rPr>
-                  <w:t xml:space="preserve">type here</w:t>
+                  <w:t xml:space="preserve">17.4 %</w:t>
                 </w:r>
               </w:sdtContent>
             </w:sdt>
@@ -6047,7 +6371,7 @@
                     <w:sz w:val="15"/>
                     <w:szCs w:val="15"/>
                   </w:rPr>
-                  <w:t xml:space="preserve">type here</w:t>
+                  <w:t xml:space="preserve">20.0 %</w:t>
                 </w:r>
               </w:sdtContent>
             </w:sdt>
@@ -6078,7 +6402,7 @@
                     <w:sz w:val="15"/>
                     <w:szCs w:val="15"/>
                   </w:rPr>
-                  <w:t xml:space="preserve">type here</w:t>
+                  <w:t xml:space="preserve">Per-session EER (pooled 30.3 %)</w:t>
                 </w:r>
               </w:sdtContent>
             </w:sdt>
@@ -6115,18 +6439,41 @@
           </w:tcPr>
           <w:p>
             <w:pPr>
-              <w:spacing w:after="0"/>
+              <w:spacing w:after="0" w:before="0"/>
               <w:jc w:val="center"/>
             </w:pPr>
-            <w:r/>
             <w:r>
-              <w:rPr>
-                <w:b w:val="0"/>
-                <w:i/>
-                <w:color w:val="595959"/>
-                <w:sz w:val="15"/>
-              </w:rPr>
-              <w:t>[ SUS box-plot (per condition) ]</w:t>
+              <w:drawing>
+                <wp:inline distT="0" distB="0" distL="0" distR="0">
+                  <wp:extent cx="3063240" cy="1664208"/>
+                  <wp:docPr id="900" name="G13 plot 1"/>
+                  <a:graphic xmlns:a="http://schemas.openxmlformats.org/drawingml/2006/main">
+                    <a:graphicData uri="http://schemas.openxmlformats.org/drawingml/2006/picture">
+                      <pic:pic xmlns:pic="http://schemas.openxmlformats.org/drawingml/2006/picture">
+                        <pic:nvPicPr>
+                          <pic:cNvPr id="900" name="g13_img1.png"/>
+                          <pic:cNvPicPr/>
+                        </pic:nvPicPr>
+                        <pic:blipFill>
+                          <a:blip r:embed="rIdImg1"/>
+                          <a:stretch>
+                            <a:fillRect/>
+                          </a:stretch>
+                        </pic:blipFill>
+                        <pic:spPr>
+                          <a:xfrm>
+                            <a:off x="0" y="0"/>
+                            <a:ext cx="3063240" cy="1664208"/>
+                          </a:xfrm>
+                          <a:prstGeom prst="rect">
+                            <a:avLst/>
+                          </a:prstGeom>
+                        </pic:spPr>
+                      </pic:pic>
+                    </a:graphicData>
+                  </a:graphic>
+                </wp:inline>
+              </w:drawing>
             </w:r>
           </w:p>
         </w:tc>
@@ -6137,18 +6484,41 @@
           </w:tcPr>
           <w:p>
             <w:pPr>
-              <w:spacing w:after="0"/>
+              <w:spacing w:after="0" w:before="0"/>
               <w:jc w:val="center"/>
             </w:pPr>
-            <w:r/>
             <w:r>
-              <w:rPr>
-                <w:b w:val="0"/>
-                <w:i/>
-                <w:color w:val="595959"/>
-                <w:sz w:val="15"/>
-              </w:rPr>
-              <w:t>[ Task-metric / latency plot ]</w:t>
+              <w:drawing>
+                <wp:inline distT="0" distB="0" distL="0" distR="0">
+                  <wp:extent cx="3063240" cy="1664208"/>
+                  <wp:docPr id="901" name="G13 plot 2"/>
+                  <a:graphic xmlns:a="http://schemas.openxmlformats.org/drawingml/2006/main">
+                    <a:graphicData uri="http://schemas.openxmlformats.org/drawingml/2006/picture">
+                      <pic:pic xmlns:pic="http://schemas.openxmlformats.org/drawingml/2006/picture">
+                        <pic:nvPicPr>
+                          <pic:cNvPr id="901" name="g13_img2.png"/>
+                          <pic:cNvPicPr/>
+                        </pic:nvPicPr>
+                        <pic:blipFill>
+                          <a:blip r:embed="rIdImg2"/>
+                          <a:stretch>
+                            <a:fillRect/>
+                          </a:stretch>
+                        </pic:blipFill>
+                        <pic:spPr>
+                          <a:xfrm>
+                            <a:off x="0" y="0"/>
+                            <a:ext cx="3063240" cy="1664208"/>
+                          </a:xfrm>
+                          <a:prstGeom prst="rect">
+                            <a:avLst/>
+                          </a:prstGeom>
+                        </pic:spPr>
+                      </pic:pic>
+                    </a:graphicData>
+                  </a:graphic>
+                </wp:inline>
+              </w:drawing>
             </w:r>
           </w:p>
         </w:tc>
@@ -6230,7 +6600,7 @@
                 </w:rPr>
                 <w:alias w:val="G13.S4.prov_real_people"/>
                 <w:tag w:val="G13.S4.prov_real_people"/>
-                <w:dropDownList>
+                <w:dropDownList w:lastValue="Yes">
                   <w:listItem w:displayText="Select ▾" w:value=""/>
                   <w:listItem w:displayText="Yes" w:value="Yes"/>
                   <w:listItem w:displayText="No" w:value="No"/>
@@ -6242,7 +6612,7 @@
                     <w:sz w:val="15"/>
                     <w:szCs w:val="15"/>
                   </w:rPr>
-                  <w:t xml:space="preserve">Select ▾</w:t>
+                  <w:t xml:space="preserve">Yes</w:t>
                 </w:r>
               </w:sdtContent>
             </w:sdt>
@@ -6293,7 +6663,7 @@
                 </w:rPr>
                 <w:alias w:val="G13.S4.prov_no_simulated"/>
                 <w:tag w:val="G13.S4.prov_no_simulated"/>
-                <w:dropDownList>
+                <w:dropDownList w:lastValue="Yes">
                   <w:listItem w:displayText="Select ▾" w:value=""/>
                   <w:listItem w:displayText="Yes" w:value="Yes"/>
                   <w:listItem w:displayText="No" w:value="No"/>
@@ -6305,7 +6675,7 @@
                     <w:sz w:val="15"/>
                     <w:szCs w:val="15"/>
                   </w:rPr>
-                  <w:t xml:space="preserve">Select ▾</w:t>
+                  <w:t xml:space="preserve">Yes</w:t>
                 </w:r>
               </w:sdtContent>
             </w:sdt>
@@ -6417,7 +6787,7 @@
                 </w:rPr>
                 <w:alias w:val="G13.S4.prov_plots_reproducible"/>
                 <w:tag w:val="G13.S4.prov_plots_reproducible"/>
-                <w:dropDownList>
+                <w:dropDownList w:lastValue="Yes">
                   <w:listItem w:displayText="Select ▾" w:value=""/>
                   <w:listItem w:displayText="Yes" w:value="Yes"/>
                   <w:listItem w:displayText="No" w:value="No"/>
@@ -6429,7 +6799,7 @@
                     <w:sz w:val="15"/>
                     <w:szCs w:val="15"/>
                   </w:rPr>
-                  <w:t xml:space="preserve">Select ▾</w:t>
+                  <w:t xml:space="preserve">Yes</w:t>
                 </w:r>
               </w:sdtContent>
             </w:sdt>
@@ -6533,7 +6903,7 @@
                     <w:sz w:val="15"/>
                     <w:szCs w:val="15"/>
                   </w:rPr>
-                  <w:t xml:space="preserve">type here</w:t>
+                  <w:t xml:space="preserve">https://lnkd.in/p/d_G32T8Q</w:t>
                 </w:r>
               </w:sdtContent>
             </w:sdt>
@@ -6592,7 +6962,7 @@
                     <w:sz w:val="15"/>
                     <w:szCs w:val="15"/>
                   </w:rPr>
-                  <w:t xml:space="preserve">type here</w:t>
+                  <w:t xml:space="preserve">3:54</w:t>
                 </w:r>
               </w:sdtContent>
             </w:sdt>
@@ -6641,7 +7011,7 @@
                 </w:rPr>
                 <w:alias w:val="G13.S5.all_members_speak"/>
                 <w:tag w:val="G13.S5.all_members_speak"/>
-                <w:dropDownList>
+                <w:dropDownList w:lastValue="Yes">
                   <w:listItem w:displayText="Select ▾" w:value=""/>
                   <w:listItem w:displayText="Yes" w:value="Yes"/>
                   <w:listItem w:displayText="No" w:value="No"/>
@@ -6653,7 +7023,7 @@
                     <w:sz w:val="15"/>
                     <w:szCs w:val="15"/>
                   </w:rPr>
-                  <w:t xml:space="preserve">Select ▾</w:t>
+                  <w:t xml:space="preserve">Yes</w:t>
                 </w:r>
               </w:sdtContent>
             </w:sdt>
@@ -6916,7 +7286,7 @@
                 </w:rPr>
                 <w:alias w:val="G13.S5.ai1.tool"/>
                 <w:tag w:val="G13.S5.ai1.tool"/>
-                <w:dropDownList>
+                <w:dropDownList w:lastValue="Claude">
                   <w:listItem w:displayText="Select ▾" w:value=""/>
                   <w:listItem w:displayText="ChatGPT" w:value="ChatGPT"/>
                   <w:listItem w:displayText="Gemini" w:value="Gemini"/>
@@ -6933,7 +7303,7 @@
                     <w:sz w:val="14"/>
                     <w:szCs w:val="14"/>
                   </w:rPr>
-                  <w:t xml:space="preserve">Select ▾</w:t>
+                  <w:t xml:space="preserve">Claude</w:t>
                 </w:r>
               </w:sdtContent>
             </w:sdt>
@@ -6965,7 +7335,7 @@
                     <w:sz w:val="14"/>
                     <w:szCs w:val="14"/>
                   </w:rPr>
-                  <w:t xml:space="preserve">type here</w:t>
+                  <w:t xml:space="preserve">Sim. of 40 users: EER 4.7 %, target met.</w:t>
                 </w:r>
               </w:sdtContent>
             </w:sdt>
@@ -6989,7 +7359,7 @@
                 </w:rPr>
                 <w:alias w:val="G13.S5.ai1.caught_by"/>
                 <w:tag w:val="G13.S5.ai1.caught_by"/>
-                <w:dropDownList>
+                <w:dropDownList w:lastValue="Ran / tested the code">
                   <w:listItem w:displayText="Select ▾" w:value=""/>
                   <w:listItem w:displayText="Checked the original source" w:value="Checked the original source"/>
                   <w:listItem w:displayText="Official documentation" w:value="Official documentation"/>
@@ -7004,7 +7374,7 @@
                     <w:sz w:val="14"/>
                     <w:szCs w:val="14"/>
                   </w:rPr>
-                  <w:t xml:space="preserve">Select ▾</w:t>
+                  <w:t xml:space="preserve">Ran / tested the code</w:t>
                 </w:r>
               </w:sdtContent>
             </w:sdt>
@@ -7036,7 +7406,7 @@
                     <w:sz w:val="14"/>
                     <w:szCs w:val="14"/>
                   </w:rPr>
-                  <w:t xml:space="preserve">type here</w:t>
+                  <w:t xml:space="preserve">Real Quest sessions: EER 17-30 %.</w:t>
                 </w:r>
               </w:sdtContent>
             </w:sdt>
@@ -7060,7 +7430,7 @@
                 </w:rPr>
                 <w:alias w:val="G13.S5.ai1.error_type"/>
                 <w:tag w:val="G13.S5.ai1.error_type"/>
-                <w:dropDownList>
+                <w:dropDownList w:lastValue="Wrong number or statistic">
                   <w:listItem w:displayText="Select ▾" w:value=""/>
                   <w:listItem w:displayText="Fabricated source / citation" w:value="Fabricated source / citation"/>
                   <w:listItem w:displayText="Real source, wrong details (author, year, venue)" w:value="Real source, wrong details (author, year, venue)"/>
@@ -7076,7 +7446,7 @@
                     <w:sz w:val="14"/>
                     <w:szCs w:val="14"/>
                   </w:rPr>
-                  <w:t xml:space="preserve">Select ▾</w:t>
+                  <w:t xml:space="preserve">Wrong number or statistic</w:t>
                 </w:r>
               </w:sdtContent>
             </w:sdt>
@@ -7100,7 +7470,7 @@
                 </w:rPr>
                 <w:alias w:val="G13.S5.ai1.verdict"/>
                 <w:tag w:val="G13.S5.ai1.verdict"/>
-                <w:dropDownList>
+                <w:dropDownList w:lastValue="Corrected">
                   <w:listItem w:displayText="Select ▾" w:value=""/>
                   <w:listItem w:displayText="Rejected" w:value="Rejected"/>
                   <w:listItem w:displayText="Corrected" w:value="Corrected"/>
@@ -7113,7 +7483,7 @@
                     <w:sz w:val="14"/>
                     <w:szCs w:val="14"/>
                   </w:rPr>
-                  <w:t xml:space="preserve">Select ▾</w:t>
+                  <w:t xml:space="preserve">Corrected</w:t>
                 </w:r>
               </w:sdtContent>
             </w:sdt>
@@ -7164,7 +7534,7 @@
                 </w:rPr>
                 <w:alias w:val="G13.S5.ai2.tool"/>
                 <w:tag w:val="G13.S5.ai2.tool"/>
-                <w:dropDownList>
+                <w:dropDownList w:lastValue="Other">
                   <w:listItem w:displayText="Select ▾" w:value=""/>
                   <w:listItem w:displayText="ChatGPT" w:value="ChatGPT"/>
                   <w:listItem w:displayText="Gemini" w:value="Gemini"/>
@@ -7181,7 +7551,7 @@
                     <w:sz w:val="14"/>
                     <w:szCs w:val="14"/>
                   </w:rPr>
-                  <w:t xml:space="preserve">Select ▾</w:t>
+                  <w:t xml:space="preserve">Other</w:t>
                 </w:r>
               </w:sdtContent>
             </w:sdt>
@@ -7213,7 +7583,7 @@
                     <w:sz w:val="14"/>
                     <w:szCs w:val="14"/>
                   </w:rPr>
-                  <w:t xml:space="preserve">type here</w:t>
+                  <w:t xml:space="preserve">Pfeuffer 2019 title: '...How They Look, Point and Walk'.</w:t>
                 </w:r>
               </w:sdtContent>
             </w:sdt>
@@ -7237,7 +7607,7 @@
                 </w:rPr>
                 <w:alias w:val="G13.S5.ai2.caught_by"/>
                 <w:tag w:val="G13.S5.ai2.caught_by"/>
-                <w:dropDownList>
+                <w:dropDownList w:lastValue="Checked the original source">
                   <w:listItem w:displayText="Select ▾" w:value=""/>
                   <w:listItem w:displayText="Checked the original source" w:value="Checked the original source"/>
                   <w:listItem w:displayText="Official documentation" w:value="Official documentation"/>
@@ -7252,7 +7622,7 @@
                     <w:sz w:val="14"/>
                     <w:szCs w:val="14"/>
                   </w:rPr>
-                  <w:t xml:space="preserve">Select ▾</w:t>
+                  <w:t xml:space="preserve">Checked the original source</w:t>
                 </w:r>
               </w:sdtContent>
             </w:sdt>
@@ -7284,7 +7654,7 @@
                     <w:sz w:val="14"/>
                     <w:szCs w:val="14"/>
                   </w:rPr>
-                  <w:t xml:space="preserve">type here</w:t>
+                  <w:t xml:space="preserve">'...Body Motion and Relations in VR', doi:10.1145/3290605.3300340</w:t>
                 </w:r>
               </w:sdtContent>
             </w:sdt>
@@ -7308,7 +7678,7 @@
                 </w:rPr>
                 <w:alias w:val="G13.S5.ai2.error_type"/>
                 <w:tag w:val="G13.S5.ai2.error_type"/>
-                <w:dropDownList>
+                <w:dropDownList w:lastValue="Real source, wrong details (author, year, venue)">
                   <w:listItem w:displayText="Select ▾" w:value=""/>
                   <w:listItem w:displayText="Fabricated source / citation" w:value="Fabricated source / citation"/>
                   <w:listItem w:displayText="Real source, wrong details (author, year, venue)" w:value="Real source, wrong details (author, year, venue)"/>
@@ -7324,7 +7694,7 @@
                     <w:sz w:val="14"/>
                     <w:szCs w:val="14"/>
                   </w:rPr>
-                  <w:t xml:space="preserve">Select ▾</w:t>
+                  <w:t xml:space="preserve">Real source, wrong details (author, year, venue)</w:t>
                 </w:r>
               </w:sdtContent>
             </w:sdt>
@@ -7348,7 +7718,7 @@
                 </w:rPr>
                 <w:alias w:val="G13.S5.ai2.verdict"/>
                 <w:tag w:val="G13.S5.ai2.verdict"/>
-                <w:dropDownList>
+                <w:dropDownList w:lastValue="Corrected">
                   <w:listItem w:displayText="Select ▾" w:value=""/>
                   <w:listItem w:displayText="Rejected" w:value="Rejected"/>
                   <w:listItem w:displayText="Corrected" w:value="Corrected"/>
@@ -7361,7 +7731,7 @@
                     <w:sz w:val="14"/>
                     <w:szCs w:val="14"/>
                   </w:rPr>
-                  <w:t xml:space="preserve">Select ▾</w:t>
+                  <w:t xml:space="preserve">Corrected</w:t>
                 </w:r>
               </w:sdtContent>
             </w:sdt>
@@ -7410,7 +7780,7 @@
                 </w:rPr>
                 <w:alias w:val="G13.S5.ai3.tool"/>
                 <w:tag w:val="G13.S5.ai3.tool"/>
-                <w:dropDownList>
+                <w:dropDownList w:lastValue="Other">
                   <w:listItem w:displayText="Select ▾" w:value=""/>
                   <w:listItem w:displayText="ChatGPT" w:value="ChatGPT"/>
                   <w:listItem w:displayText="Gemini" w:value="Gemini"/>
@@ -7427,7 +7797,7 @@
                     <w:sz w:val="14"/>
                     <w:szCs w:val="14"/>
                   </w:rPr>
-                  <w:t xml:space="preserve">Select ▾</w:t>
+                  <w:t xml:space="preserve">Other</w:t>
                 </w:r>
               </w:sdtContent>
             </w:sdt>
@@ -7458,7 +7828,7 @@
                     <w:sz w:val="14"/>
                     <w:szCs w:val="14"/>
                   </w:rPr>
-                  <w:t xml:space="preserve">type here</w:t>
+                  <w:t xml:space="preserve">README: empirical N=50, EER 4.12 %.</w:t>
                 </w:r>
               </w:sdtContent>
             </w:sdt>
@@ -7481,7 +7851,7 @@
                 </w:rPr>
                 <w:alias w:val="G13.S5.ai3.caught_by"/>
                 <w:tag w:val="G13.S5.ai3.caught_by"/>
-                <w:dropDownList>
+                <w:dropDownList w:lastValue="Checked the original source">
                   <w:listItem w:displayText="Select ▾" w:value=""/>
                   <w:listItem w:displayText="Checked the original source" w:value="Checked the original source"/>
                   <w:listItem w:displayText="Official documentation" w:value="Official documentation"/>
@@ -7496,7 +7866,7 @@
                     <w:sz w:val="14"/>
                     <w:szCs w:val="14"/>
                   </w:rPr>
-                  <w:t xml:space="preserve">Select ▾</w:t>
+                  <w:t xml:space="preserve">Checked the original source</w:t>
                 </w:r>
               </w:sdtContent>
             </w:sdt>
@@ -7527,7 +7897,7 @@
                     <w:sz w:val="14"/>
                     <w:szCs w:val="14"/>
                   </w:rPr>
-                  <w:t xml:space="preserve">type here</w:t>
+                  <w:t xml:space="preserve">No such study (simulated). Real: N = 4.</w:t>
                 </w:r>
               </w:sdtContent>
             </w:sdt>
@@ -7550,7 +7920,7 @@
                 </w:rPr>
                 <w:alias w:val="G13.S5.ai3.error_type"/>
                 <w:tag w:val="G13.S5.ai3.error_type"/>
-                <w:dropDownList>
+                <w:dropDownList w:lastValue="Wrong number or statistic">
                   <w:listItem w:displayText="Select ▾" w:value=""/>
                   <w:listItem w:displayText="Fabricated source / citation" w:value="Fabricated source / citation"/>
                   <w:listItem w:displayText="Real source, wrong details (author, year, venue)" w:value="Real source, wrong details (author, year, venue)"/>
@@ -7566,7 +7936,7 @@
                     <w:sz w:val="14"/>
                     <w:szCs w:val="14"/>
                   </w:rPr>
-                  <w:t xml:space="preserve">Select ▾</w:t>
+                  <w:t xml:space="preserve">Wrong number or statistic</w:t>
                 </w:r>
               </w:sdtContent>
             </w:sdt>
@@ -7589,7 +7959,7 @@
                 </w:rPr>
                 <w:alias w:val="G13.S5.ai3.verdict"/>
                 <w:tag w:val="G13.S5.ai3.verdict"/>
-                <w:dropDownList>
+                <w:dropDownList w:lastValue="Rejected">
                   <w:listItem w:displayText="Select ▾" w:value=""/>
                   <w:listItem w:displayText="Rejected" w:value="Rejected"/>
                   <w:listItem w:displayText="Corrected" w:value="Corrected"/>
@@ -7602,7 +7972,7 @@
                     <w:sz w:val="14"/>
                     <w:szCs w:val="14"/>
                   </w:rPr>
-                  <w:t xml:space="preserve">Select ▾</w:t>
+                  <w:t xml:space="preserve">Rejected</w:t>
                 </w:r>
               </w:sdtContent>
             </w:sdt>
@@ -8066,7 +8436,7 @@
                     <w:sz w:val="14"/>
                     <w:szCs w:val="14"/>
                   </w:rPr>
-                  <w:t xml:space="preserve">type here</w:t>
+                  <w:t xml:space="preserve">1:49</w:t>
                 </w:r>
               </w:sdtContent>
             </w:sdt>
@@ -8098,7 +8468,7 @@
                     <w:sz w:val="14"/>
                     <w:szCs w:val="14"/>
                   </w:rPr>
-                  <w:t xml:space="preserve">type here</w:t>
+                  <w:t xml:space="preserve">How did you connect your RL (SAC) model to Unity in real time?</w:t>
                 </w:r>
               </w:sdtContent>
             </w:sdt>
@@ -8672,7 +9042,7 @@
                     <w:sz w:val="14"/>
                     <w:szCs w:val="14"/>
                   </w:rPr>
-                  <w:t xml:space="preserve">type here</w:t>
+                  <w:t xml:space="preserve">About 60</w:t>
                 </w:r>
               </w:sdtContent>
             </w:sdt>
@@ -8696,7 +9066,7 @@
                 </w:rPr>
                 <w:alias w:val="G13.S6.I001.role_fit"/>
                 <w:tag w:val="G13.S6.I001.role_fit"/>
-                <w:dropDownList>
+                <w:dropDownList w:lastValue="5">
                   <w:listItem w:displayText="Select ▾" w:value=""/>
                   <w:listItem w:displayText="1" w:value="1"/>
                   <w:listItem w:displayText="2" w:value="2"/>
@@ -8711,7 +9081,7 @@
                     <w:sz w:val="14"/>
                     <w:szCs w:val="14"/>
                   </w:rPr>
-                  <w:t xml:space="preserve">Select ▾</w:t>
+                  <w:t xml:space="preserve">5</w:t>
                 </w:r>
               </w:sdtContent>
             </w:sdt>
@@ -8735,7 +9105,7 @@
                 </w:rPr>
                 <w:alias w:val="G13.S6.I001.prior_git"/>
                 <w:tag w:val="G13.S6.I001.prior_git"/>
-                <w:dropDownList>
+                <w:dropDownList w:lastValue="Git only">
                   <w:listItem w:displayText="Select ▾" w:value=""/>
                   <w:listItem w:displayText="Neither Git nor LFS" w:value="Neither Git nor LFS"/>
                   <w:listItem w:displayText="Git only" w:value="Git only"/>
@@ -8748,7 +9118,7 @@
                     <w:sz w:val="14"/>
                     <w:szCs w:val="14"/>
                   </w:rPr>
-                  <w:t xml:space="preserve">Select ▾</w:t>
+                  <w:t xml:space="preserve">Git only</w:t>
                 </w:r>
               </w:sdtContent>
             </w:sdt>
@@ -8772,7 +9142,7 @@
                 </w:rPr>
                 <w:alias w:val="G13.S6.I001.prior_user_test"/>
                 <w:tag w:val="G13.S6.I001.prior_user_test"/>
-                <w:dropDownList>
+                <w:dropDownList w:lastValue="Yes">
                   <w:listItem w:displayText="Select ▾" w:value=""/>
                   <w:listItem w:displayText="Yes" w:value="Yes"/>
                   <w:listItem w:displayText="No" w:value="No"/>
@@ -8784,7 +9154,7 @@
                     <w:sz w:val="14"/>
                     <w:szCs w:val="14"/>
                   </w:rPr>
-                  <w:t xml:space="preserve">Select ▾</w:t>
+                  <w:t xml:space="preserve">Yes</w:t>
                 </w:r>
               </w:sdtContent>
             </w:sdt>
@@ -8808,7 +9178,7 @@
                 </w:rPr>
                 <w:alias w:val="G13.S6.I001.cross_programme_learning"/>
                 <w:tag w:val="G13.S6.I001.cross_programme_learning"/>
-                <w:dropDownList>
+                <w:dropDownList w:lastValue="Yes">
                   <w:listItem w:displayText="Select ▾" w:value=""/>
                   <w:listItem w:displayText="Yes" w:value="Yes"/>
                   <w:listItem w:displayText="No" w:value="No"/>
@@ -8820,7 +9190,7 @@
                     <w:sz w:val="14"/>
                     <w:szCs w:val="14"/>
                   </w:rPr>
-                  <w:t xml:space="preserve">Select ▾</w:t>
+                  <w:t xml:space="preserve">Yes</w:t>
                 </w:r>
               </w:sdtContent>
             </w:sdt>
@@ -8844,7 +9214,7 @@
                 </w:rPr>
                 <w:alias w:val="G13.S6.I001.ai_draft_share"/>
                 <w:tag w:val="G13.S6.I001.ai_draft_share"/>
-                <w:dropDownList>
+                <w:dropDownList w:lastValue="0–25 %">
                   <w:listItem w:displayText="Select ▾" w:value=""/>
                   <w:listItem w:displayText="0–25 %" w:value="0–25 %"/>
                   <w:listItem w:displayText="26–50 %" w:value="26–50 %"/>
@@ -8858,7 +9228,7 @@
                     <w:sz w:val="14"/>
                     <w:szCs w:val="14"/>
                   </w:rPr>
-                  <w:t xml:space="preserve">Select ▾</w:t>
+                  <w:t xml:space="preserve">0–25 %</w:t>
                 </w:r>
               </w:sdtContent>
             </w:sdt>
@@ -8882,7 +9252,7 @@
                 </w:rPr>
                 <w:alias w:val="G13.S6.I001.ai_errors_caught"/>
                 <w:tag w:val="G13.S6.I001.ai_errors_caught"/>
-                <w:dropDownList>
+                <w:dropDownList w:lastValue="0">
                   <w:listItem w:displayText="Select ▾" w:value=""/>
                   <w:listItem w:displayText="0" w:value="0"/>
                   <w:listItem w:displayText="1–2" w:value="1–2"/>
@@ -8896,7 +9266,7 @@
                     <w:sz w:val="14"/>
                     <w:szCs w:val="14"/>
                   </w:rPr>
-                  <w:t xml:space="preserve">Select ▾</w:t>
+                  <w:t xml:space="preserve">0</w:t>
                 </w:r>
               </w:sdtContent>
             </w:sdt>
@@ -8955,7 +9325,7 @@
                     <w:sz w:val="14"/>
                     <w:szCs w:val="14"/>
                   </w:rPr>
-                  <w:t xml:space="preserve">type here</w:t>
+                  <w:t xml:space="preserve">About 50</w:t>
                 </w:r>
               </w:sdtContent>
             </w:sdt>
@@ -8979,7 +9349,7 @@
                 </w:rPr>
                 <w:alias w:val="G13.S6.I007.role_fit"/>
                 <w:tag w:val="G13.S6.I007.role_fit"/>
-                <w:dropDownList>
+                <w:dropDownList w:lastValue="5">
                   <w:listItem w:displayText="Select ▾" w:value=""/>
                   <w:listItem w:displayText="1" w:value="1"/>
                   <w:listItem w:displayText="2" w:value="2"/>
@@ -8994,7 +9364,7 @@
                     <w:sz w:val="14"/>
                     <w:szCs w:val="14"/>
                   </w:rPr>
-                  <w:t xml:space="preserve">Select ▾</w:t>
+                  <w:t xml:space="preserve">5</w:t>
                 </w:r>
               </w:sdtContent>
             </w:sdt>
@@ -9018,7 +9388,7 @@
                 </w:rPr>
                 <w:alias w:val="G13.S6.I007.prior_git"/>
                 <w:tag w:val="G13.S6.I007.prior_git"/>
-                <w:dropDownList>
+                <w:dropDownList w:lastValue="Git only">
                   <w:listItem w:displayText="Select ▾" w:value=""/>
                   <w:listItem w:displayText="Neither Git nor LFS" w:value="Neither Git nor LFS"/>
                   <w:listItem w:displayText="Git only" w:value="Git only"/>
@@ -9031,7 +9401,7 @@
                     <w:sz w:val="14"/>
                     <w:szCs w:val="14"/>
                   </w:rPr>
-                  <w:t xml:space="preserve">Select ▾</w:t>
+                  <w:t xml:space="preserve">Git only</w:t>
                 </w:r>
               </w:sdtContent>
             </w:sdt>
@@ -9055,7 +9425,7 @@
                 </w:rPr>
                 <w:alias w:val="G13.S6.I007.prior_user_test"/>
                 <w:tag w:val="G13.S6.I007.prior_user_test"/>
-                <w:dropDownList>
+                <w:dropDownList w:lastValue="Yes">
                   <w:listItem w:displayText="Select ▾" w:value=""/>
                   <w:listItem w:displayText="Yes" w:value="Yes"/>
                   <w:listItem w:displayText="No" w:value="No"/>
@@ -9067,7 +9437,7 @@
                     <w:sz w:val="14"/>
                     <w:szCs w:val="14"/>
                   </w:rPr>
-                  <w:t xml:space="preserve">Select ▾</w:t>
+                  <w:t xml:space="preserve">Yes</w:t>
                 </w:r>
               </w:sdtContent>
             </w:sdt>
@@ -9091,7 +9461,7 @@
                 </w:rPr>
                 <w:alias w:val="G13.S6.I007.cross_programme_learning"/>
                 <w:tag w:val="G13.S6.I007.cross_programme_learning"/>
-                <w:dropDownList>
+                <w:dropDownList w:lastValue="Yes">
                   <w:listItem w:displayText="Select ▾" w:value=""/>
                   <w:listItem w:displayText="Yes" w:value="Yes"/>
                   <w:listItem w:displayText="No" w:value="No"/>
@@ -9103,7 +9473,7 @@
                     <w:sz w:val="14"/>
                     <w:szCs w:val="14"/>
                   </w:rPr>
-                  <w:t xml:space="preserve">Select ▾</w:t>
+                  <w:t xml:space="preserve">Yes</w:t>
                 </w:r>
               </w:sdtContent>
             </w:sdt>
@@ -9238,7 +9608,7 @@
                     <w:sz w:val="14"/>
                     <w:szCs w:val="14"/>
                   </w:rPr>
-                  <w:t xml:space="preserve">type here</w:t>
+                  <w:t xml:space="preserve">50</w:t>
                 </w:r>
               </w:sdtContent>
             </w:sdt>
@@ -9262,7 +9632,7 @@
                 </w:rPr>
                 <w:alias w:val="G13.S6.I013.role_fit"/>
                 <w:tag w:val="G13.S6.I013.role_fit"/>
-                <w:dropDownList>
+                <w:dropDownList w:lastValue="5">
                   <w:listItem w:displayText="Select ▾" w:value=""/>
                   <w:listItem w:displayText="1" w:value="1"/>
                   <w:listItem w:displayText="2" w:value="2"/>
@@ -9277,7 +9647,7 @@
                     <w:sz w:val="14"/>
                     <w:szCs w:val="14"/>
                   </w:rPr>
-                  <w:t xml:space="preserve">Select ▾</w:t>
+                  <w:t xml:space="preserve">5</w:t>
                 </w:r>
               </w:sdtContent>
             </w:sdt>
@@ -9301,7 +9671,7 @@
                 </w:rPr>
                 <w:alias w:val="G13.S6.I013.prior_git"/>
                 <w:tag w:val="G13.S6.I013.prior_git"/>
-                <w:dropDownList>
+                <w:dropDownList w:lastValue="Git only">
                   <w:listItem w:displayText="Select ▾" w:value=""/>
                   <w:listItem w:displayText="Neither Git nor LFS" w:value="Neither Git nor LFS"/>
                   <w:listItem w:displayText="Git only" w:value="Git only"/>
@@ -9314,7 +9684,7 @@
                     <w:sz w:val="14"/>
                     <w:szCs w:val="14"/>
                   </w:rPr>
-                  <w:t xml:space="preserve">Select ▾</w:t>
+                  <w:t xml:space="preserve">Git only</w:t>
                 </w:r>
               </w:sdtContent>
             </w:sdt>
@@ -9338,7 +9708,7 @@
                 </w:rPr>
                 <w:alias w:val="G13.S6.I013.prior_user_test"/>
                 <w:tag w:val="G13.S6.I013.prior_user_test"/>
-                <w:dropDownList>
+                <w:dropDownList w:lastValue="Yes">
                   <w:listItem w:displayText="Select ▾" w:value=""/>
                   <w:listItem w:displayText="Yes" w:value="Yes"/>
                   <w:listItem w:displayText="No" w:value="No"/>
@@ -9350,7 +9720,7 @@
                     <w:sz w:val="14"/>
                     <w:szCs w:val="14"/>
                   </w:rPr>
-                  <w:t xml:space="preserve">Select ▾</w:t>
+                  <w:t xml:space="preserve">Yes</w:t>
                 </w:r>
               </w:sdtContent>
             </w:sdt>
@@ -9374,7 +9744,7 @@
                 </w:rPr>
                 <w:alias w:val="G13.S6.I013.cross_programme_learning"/>
                 <w:tag w:val="G13.S6.I013.cross_programme_learning"/>
-                <w:dropDownList>
+                <w:dropDownList w:lastValue="Yes">
                   <w:listItem w:displayText="Select ▾" w:value=""/>
                   <w:listItem w:displayText="Yes" w:value="Yes"/>
                   <w:listItem w:displayText="No" w:value="No"/>
@@ -9386,7 +9756,7 @@
                     <w:sz w:val="14"/>
                     <w:szCs w:val="14"/>
                   </w:rPr>
-                  <w:t xml:space="preserve">Select ▾</w:t>
+                  <w:t xml:space="preserve">Yes</w:t>
                 </w:r>
               </w:sdtContent>
             </w:sdt>
@@ -9886,7 +10256,7 @@
                     <w:sz w:val="14"/>
                     <w:szCs w:val="14"/>
                   </w:rPr>
-                  <w:t xml:space="preserve">type here</w:t>
+                  <w:t xml:space="preserve">Real data humbled us: under 5% error in simulation, nowhere close on real people. Posture (sitting vs standing) mattered most.</w:t>
                 </w:r>
               </w:sdtContent>
             </w:sdt>
@@ -9977,7 +10347,7 @@
                     <w:sz w:val="14"/>
                     <w:szCs w:val="14"/>
                   </w:rPr>
-                  <w:t xml:space="preserve">type here</w:t>
+                  <w:t xml:space="preserve">Designing for continuous checking: most logins check you once at the door; we kept checking for the whole session.</w:t>
                 </w:r>
               </w:sdtContent>
             </w:sdt>
@@ -10068,7 +10438,7 @@
                     <w:sz w:val="14"/>
                     <w:szCs w:val="14"/>
                   </w:rPr>
-                  <w:t xml:space="preserve">type here</w:t>
+                  <w:t xml:space="preserve">Verifying AI output: it gave a 2019 paper with the wrong title, and we confirmed the real one by DOI and title.</w:t>
                 </w:r>
               </w:sdtContent>
             </w:sdt>
@@ -10157,7 +10527,7 @@
                     <w:sz w:val="14"/>
                     <w:szCs w:val="14"/>
                   </w:rPr>
-                  <w:t xml:space="preserve">type here</w:t>
+                  <w:t xml:space="preserve">Testing on the headset caught an AI-code bug: room-coordinate features made joystick movement look like a different person.</w:t>
                 </w:r>
               </w:sdtContent>
             </w:sdt>
@@ -10759,7 +11129,7 @@
                 </w:rPr>
                 <w:alias w:val="G13.SIGN.I001.original"/>
                 <w:tag w:val="G13.SIGN.I001.original"/>
-                <w:dropDownList>
+                <w:dropDownList w:lastValue="Yes">
                   <w:listItem w:displayText="Select ▾" w:value=""/>
                   <w:listItem w:displayText="Yes" w:value="Yes"/>
                   <w:listItem w:displayText="No" w:value="No"/>
@@ -10771,7 +11141,7 @@
                     <w:sz w:val="15"/>
                     <w:szCs w:val="15"/>
                   </w:rPr>
-                  <w:t xml:space="preserve">Select ▾</w:t>
+                  <w:t xml:space="preserve">Yes</w:t>
                 </w:r>
               </w:sdtContent>
             </w:sdt>
@@ -10795,7 +11165,7 @@
                 </w:rPr>
                 <w:alias w:val="G13.SIGN.I001.code_runs"/>
                 <w:tag w:val="G13.SIGN.I001.code_runs"/>
-                <w:dropDownList>
+                <w:dropDownList w:lastValue="Yes">
                   <w:listItem w:displayText="Select ▾" w:value=""/>
                   <w:listItem w:displayText="Yes" w:value="Yes"/>
                   <w:listItem w:displayText="No" w:value="No"/>
@@ -10807,7 +11177,7 @@
                     <w:sz w:val="15"/>
                     <w:szCs w:val="15"/>
                   </w:rPr>
-                  <w:t xml:space="preserve">Select ▾</w:t>
+                  <w:t xml:space="preserve">Yes</w:t>
                 </w:r>
               </w:sdtContent>
             </w:sdt>
@@ -10831,7 +11201,7 @@
                 </w:rPr>
                 <w:alias w:val="G13.SIGN.I001.viva_ready"/>
                 <w:tag w:val="G13.SIGN.I001.viva_ready"/>
-                <w:dropDownList>
+                <w:dropDownList w:lastValue="Yes">
                   <w:listItem w:displayText="Select ▾" w:value=""/>
                   <w:listItem w:displayText="Yes" w:value="Yes"/>
                   <w:listItem w:displayText="No" w:value="No"/>
@@ -10843,7 +11213,7 @@
                     <w:sz w:val="15"/>
                     <w:szCs w:val="15"/>
                   </w:rPr>
-                  <w:t xml:space="preserve">Select ▾</w:t>
+                  <w:t xml:space="preserve">Yes</w:t>
                 </w:r>
               </w:sdtContent>
             </w:sdt>
@@ -10856,7 +11226,140 @@
           <w:p>
             <w:pPr>
               <w:keepNext/>
-            </w:pPr>
+              <w:spacing w:after="0" w:line="240" w:lineRule="auto"/>
+            </w:pPr>
+            <w:r>
+              <w:drawing>
+                <wp:anchor distT="0" distB="0" distL="114300" distR="114300" simplePos="0" relativeHeight="251659264" behindDoc="0" locked="0" layoutInCell="1" allowOverlap="1">
+                  <wp:simplePos x="0" y="0"/>
+                  <wp:positionH relativeFrom="column">
+                    <wp:posOffset>167640</wp:posOffset>
+                  </wp:positionH>
+                  <wp:positionV relativeFrom="paragraph">
+                    <wp:posOffset>10160</wp:posOffset>
+                  </wp:positionV>
+                  <wp:extent cx="567690" cy="233045"/>
+                  <wp:effectExtent l="0" t="0" r="0" b="0"/>
+                  <wp:wrapNone/>
+                  <wp:docPr id="9000" name="image5.png"/>
+                  <wp:cNvGraphicFramePr/>
+                  <a:graphic xmlns:a="http://schemas.openxmlformats.org/drawingml/2006/main">
+                    <a:graphicData uri="http://schemas.openxmlformats.org/drawingml/2006/picture">
+                      <pic:pic xmlns:pic="http://schemas.openxmlformats.org/drawingml/2006/picture">
+                        <pic:nvPicPr>
+                          <pic:cNvPr id="5" name="image5.png"/>
+                          <pic:cNvPicPr preferRelativeResize="0"/>
+                        </pic:nvPicPr>
+                        <pic:blipFill>
+                          <a:blip r:embed="rIdSigK1"/>
+                          <a:srcRect/>
+                          <a:stretch>
+                            <a:fillRect/>
+                          </a:stretch>
+                        </pic:blipFill>
+                        <pic:spPr>
+                          <a:xfrm>
+                            <a:off x="0" y="0"/>
+                            <a:ext cx="567690" cy="233045"/>
+                          </a:xfrm>
+                          <a:prstGeom prst="rect">
+                            <a:avLst/>
+                          </a:prstGeom>
+                        </pic:spPr>
+                      </pic:pic>
+                    </a:graphicData>
+                  </a:graphic>
+                </wp:anchor>
+              </w:drawing>
+            </w:r>
+            <w:r>
+              <w:drawing>
+                <wp:anchor distT="0" distB="0" distL="114300" distR="114300" simplePos="0" relativeHeight="251659264" behindDoc="0" locked="0" layoutInCell="1" allowOverlap="1">
+                  <wp:simplePos x="0" y="0"/>
+                  <wp:positionH relativeFrom="column">
+                    <wp:posOffset>165100</wp:posOffset>
+                  </wp:positionH>
+                  <wp:positionV relativeFrom="paragraph">
+                    <wp:posOffset>69850</wp:posOffset>
+                  </wp:positionV>
+                  <wp:extent cx="226695" cy="304800"/>
+                  <wp:effectExtent l="0" t="0" r="0" b="0"/>
+                  <wp:wrapNone/>
+                  <wp:docPr id="9000" name="image1.png"/>
+                  <wp:cNvGraphicFramePr/>
+                  <a:graphic xmlns:a="http://schemas.openxmlformats.org/drawingml/2006/main">
+                    <a:graphicData uri="http://schemas.openxmlformats.org/drawingml/2006/picture">
+                      <pic:pic xmlns:pic="http://schemas.openxmlformats.org/drawingml/2006/picture">
+                        <pic:nvPicPr>
+                          <pic:cNvPr id="4" name="image1.png"/>
+                          <pic:cNvPicPr preferRelativeResize="0"/>
+                        </pic:nvPicPr>
+                        <pic:blipFill>
+                          <a:blip r:embed="rIdSigK2"/>
+                          <a:srcRect/>
+                          <a:stretch>
+                            <a:fillRect/>
+                          </a:stretch>
+                        </pic:blipFill>
+                        <pic:spPr>
+                          <a:xfrm>
+                            <a:off x="0" y="0"/>
+                            <a:ext cx="226695" cy="304800"/>
+                          </a:xfrm>
+                          <a:prstGeom prst="rect">
+                            <a:avLst/>
+                          </a:prstGeom>
+                        </pic:spPr>
+                      </pic:pic>
+                    </a:graphicData>
+                  </a:graphic>
+                </wp:anchor>
+              </w:drawing>
+            </w:r>
+            <w:r>
+              <w:drawing>
+                <wp:anchor distT="0" distB="0" distL="114300" distR="114300" simplePos="0" relativeHeight="251659264" behindDoc="0" locked="0" layoutInCell="1" allowOverlap="1">
+                  <wp:simplePos x="0" y="0"/>
+                  <wp:positionH relativeFrom="column">
+                    <wp:posOffset>114935</wp:posOffset>
+                  </wp:positionH>
+                  <wp:positionV relativeFrom="paragraph">
+                    <wp:posOffset>-244475</wp:posOffset>
+                  </wp:positionV>
+                  <wp:extent cx="924560" cy="559435"/>
+                  <wp:effectExtent l="0" t="0" r="0" b="0"/>
+                  <wp:wrapNone/>
+                  <wp:docPr id="9000" name="image2.png"/>
+                  <wp:cNvGraphicFramePr/>
+                  <a:graphic xmlns:a="http://schemas.openxmlformats.org/drawingml/2006/main">
+                    <a:graphicData uri="http://schemas.openxmlformats.org/drawingml/2006/picture">
+                      <pic:pic xmlns:pic="http://schemas.openxmlformats.org/drawingml/2006/picture">
+                        <pic:nvPicPr>
+                          <pic:cNvPr id="1" name="image2.png"/>
+                          <pic:cNvPicPr preferRelativeResize="0"/>
+                        </pic:nvPicPr>
+                        <pic:blipFill>
+                          <a:blip r:embed="rIdSigK3"/>
+                          <a:srcRect/>
+                          <a:stretch>
+                            <a:fillRect/>
+                          </a:stretch>
+                        </pic:blipFill>
+                        <pic:spPr>
+                          <a:xfrm>
+                            <a:off x="0" y="0"/>
+                            <a:ext cx="924560" cy="559435"/>
+                          </a:xfrm>
+                          <a:prstGeom prst="rect">
+                            <a:avLst/>
+                          </a:prstGeom>
+                        </pic:spPr>
+                      </pic:pic>
+                    </a:graphicData>
+                  </a:graphic>
+                </wp:anchor>
+              </w:drawing>
+            </w:r>
           </w:p>
         </w:tc>
         <w:tc>

</xml_diff>